<commit_message>
Update RICE POT prompt documents
</commit_message>
<xml_diff>
--- a/Assignments/Prompt_Engineering_Tasks/PROMPT to GENERATE TEST SCENARIO and TEST CASES using RICE POT Framework.docx
+++ b/Assignments/Prompt_Engineering_Tasks/PROMPT to GENERATE TEST SCENARIO and TEST CASES using RICE POT Framework.docx
@@ -1125,6 +1125,13 @@
           <w:bCs/>
         </w:rPr>
         <w:t>Software Test Case Template:</w:t>
+      </w:r>
+      <w:r>
+        <w:rPr>
+          <w:b/>
+          <w:bCs/>
+        </w:rPr>
+        <w:t xml:space="preserve"> </w:t>
       </w:r>
     </w:p>
     <w:p>
@@ -1141,7 +1148,25 @@
             <w:b/>
             <w:bCs/>
           </w:rPr>
-          <w:t>Prompt-Engineering-Task/Test cases - Ultimate _ TheTestingAcademy.xlsx at main · simran-s02/Prompt-Engineering-Task</w:t>
+          <w:t>AI-Tester-Blueprint-4x/Assignments/</w:t>
+        </w:r>
+        <w:proofErr w:type="spellStart"/>
+        <w:r>
+          <w:rPr>
+            <w:rStyle w:val="Hyperlink"/>
+            <w:b/>
+            <w:bCs/>
+          </w:rPr>
+          <w:t>Prompt_Engineering_Tasks</w:t>
+        </w:r>
+        <w:proofErr w:type="spellEnd"/>
+        <w:r>
+          <w:rPr>
+            <w:rStyle w:val="Hyperlink"/>
+            <w:b/>
+            <w:bCs/>
+          </w:rPr>
+          <w:t>/Test cases - Ultimate _ TheTestingAcademy.xlsx at main · simran-s02/AI-Tester-Blueprint-4x</w:t>
         </w:r>
       </w:hyperlink>
     </w:p>
@@ -4701,7 +4726,6 @@
   <w:style w:type="character" w:default="1" w:styleId="DefaultParagraphFont">
     <w:name w:val="Default Paragraph Font"/>
     <w:uiPriority w:val="1"/>
-    <w:semiHidden/>
     <w:unhideWhenUsed/>
   </w:style>
   <w:style w:type="table" w:default="1" w:styleId="TableNormal">

</xml_diff>